<commit_message>
Abstract report: left-align body text instead of Thai distributed justification
Co-Authored-By: Claude Fable 5.1 <noreply@anthropic.com>
Claude-Session: https://claude.ai/code/session_01MJB3WpVo3kuH25GjttwApw
</commit_message>
<xml_diff>
--- a/reports/ABSTRACT_REPORT_ENG501.docx
+++ b/reports/ABSTRACT_REPORT_ENG501.docx
@@ -251,7 +251,7 @@
       <w:pPr>
         <w:widowControl/>
         <w:spacing w:after="140" w:line="320"/>
-        <w:jc w:val="thaiDistribute"/>
+        <w:jc w:val="left"/>
       </w:pPr>
       <w:r>
         <w:rPr>
@@ -1284,7 +1284,7 @@
       <w:pPr>
         <w:widowControl/>
         <w:spacing w:after="140" w:line="320"/>
-        <w:jc w:val="thaiDistribute"/>
+        <w:jc w:val="left"/>
       </w:pPr>
       <w:r>
         <w:rPr>
@@ -1334,7 +1334,7 @@
       <w:pPr>
         <w:widowControl/>
         <w:spacing w:after="140" w:line="320"/>
-        <w:jc w:val="thaiDistribute"/>
+        <w:jc w:val="left"/>
       </w:pPr>
       <w:r>
         <w:rPr>
@@ -1576,7 +1576,7 @@
       <w:pPr>
         <w:widowControl/>
         <w:spacing w:after="140" w:line="320"/>
-        <w:jc w:val="thaiDistribute"/>
+        <w:jc w:val="left"/>
       </w:pPr>
       <w:r>
         <w:rPr>
@@ -1626,7 +1626,7 @@
       <w:pPr>
         <w:widowControl/>
         <w:spacing w:after="140" w:line="320"/>
-        <w:jc w:val="thaiDistribute"/>
+        <w:jc w:val="left"/>
       </w:pPr>
       <w:r>
         <w:rPr>
@@ -1868,7 +1868,7 @@
       <w:pPr>
         <w:widowControl/>
         <w:spacing w:after="140" w:line="320"/>
-        <w:jc w:val="thaiDistribute"/>
+        <w:jc w:val="left"/>
       </w:pPr>
       <w:r>
         <w:rPr>
@@ -1918,7 +1918,7 @@
       <w:pPr>
         <w:widowControl/>
         <w:spacing w:after="140" w:line="320"/>
-        <w:jc w:val="thaiDistribute"/>
+        <w:jc w:val="left"/>
       </w:pPr>
       <w:r>
         <w:rPr>
@@ -2161,7 +2161,7 @@
         <w:widowControl/>
         <w:spacing w:after="120" w:line="320"/>
         <w:ind w:left="360"/>
-        <w:jc w:val="thaiDistribute"/>
+        <w:jc w:val="left"/>
       </w:pPr>
       <w:r>
         <w:rPr>
@@ -2188,7 +2188,7 @@
         <w:widowControl/>
         <w:spacing w:after="120" w:line="320"/>
         <w:ind w:left="360"/>
-        <w:jc w:val="thaiDistribute"/>
+        <w:jc w:val="left"/>
       </w:pPr>
       <w:r>
         <w:rPr>
@@ -2215,7 +2215,7 @@
         <w:widowControl/>
         <w:spacing w:after="120" w:line="320"/>
         <w:ind w:left="360"/>
-        <w:jc w:val="thaiDistribute"/>
+        <w:jc w:val="left"/>
       </w:pPr>
       <w:r>
         <w:rPr>
@@ -2242,7 +2242,7 @@
         <w:widowControl/>
         <w:spacing w:after="120" w:line="320"/>
         <w:ind w:left="360"/>
-        <w:jc w:val="thaiDistribute"/>
+        <w:jc w:val="left"/>
       </w:pPr>
       <w:r>
         <w:rPr>
@@ -2269,7 +2269,7 @@
         <w:widowControl/>
         <w:spacing w:after="120" w:line="320"/>
         <w:ind w:left="360"/>
-        <w:jc w:val="thaiDistribute"/>
+        <w:jc w:val="left"/>
       </w:pPr>
       <w:r>
         <w:rPr>
@@ -2296,7 +2296,7 @@
         <w:widowControl/>
         <w:spacing w:after="120" w:line="320"/>
         <w:ind w:left="360"/>
-        <w:jc w:val="thaiDistribute"/>
+        <w:jc w:val="left"/>
       </w:pPr>
       <w:r>
         <w:rPr>
@@ -2358,7 +2358,7 @@
         <w:widowControl/>
         <w:spacing w:after="120" w:line="320"/>
         <w:ind w:left="360"/>
-        <w:jc w:val="thaiDistribute"/>
+        <w:jc w:val="left"/>
       </w:pPr>
       <w:r>
         <w:rPr>
@@ -2385,7 +2385,7 @@
         <w:widowControl/>
         <w:spacing w:after="120" w:line="320"/>
         <w:ind w:left="360"/>
-        <w:jc w:val="thaiDistribute"/>
+        <w:jc w:val="left"/>
       </w:pPr>
       <w:r>
         <w:rPr>
@@ -2412,7 +2412,7 @@
         <w:widowControl/>
         <w:spacing w:after="120" w:line="320"/>
         <w:ind w:left="360"/>
-        <w:jc w:val="thaiDistribute"/>
+        <w:jc w:val="left"/>
       </w:pPr>
       <w:r>
         <w:rPr>
@@ -2439,7 +2439,7 @@
         <w:widowControl/>
         <w:spacing w:after="120" w:line="320"/>
         <w:ind w:left="360"/>
-        <w:jc w:val="thaiDistribute"/>
+        <w:jc w:val="left"/>
       </w:pPr>
       <w:r>
         <w:rPr>
@@ -2466,7 +2466,7 @@
         <w:widowControl/>
         <w:spacing w:after="120" w:line="320"/>
         <w:ind w:left="360"/>
-        <w:jc w:val="thaiDistribute"/>
+        <w:jc w:val="left"/>
       </w:pPr>
       <w:r>
         <w:rPr>
@@ -2493,7 +2493,7 @@
         <w:widowControl/>
         <w:spacing w:after="120" w:line="320"/>
         <w:ind w:left="360"/>
-        <w:jc w:val="thaiDistribute"/>
+        <w:jc w:val="left"/>
       </w:pPr>
       <w:r>
         <w:rPr>
@@ -2746,7 +2746,7 @@
       <w:pPr>
         <w:widowControl/>
         <w:spacing w:after="140" w:line="320"/>
-        <w:jc w:val="thaiDistribute"/>
+        <w:jc w:val="left"/>
       </w:pPr>
       <w:r>
         <w:rPr>
@@ -2796,7 +2796,7 @@
       <w:pPr>
         <w:widowControl/>
         <w:spacing w:after="140" w:line="320"/>
-        <w:jc w:val="thaiDistribute"/>
+        <w:jc w:val="left"/>
       </w:pPr>
       <w:r>
         <w:rPr>

</xml_diff>

<commit_message>
Abstract report: left-aligned body text with 1.5 line spacing
Co-Authored-By: Claude Fable 5.1 <noreply@anthropic.com>
Claude-Session: https://claude.ai/code/session_01MJB3WpVo3kuH25GjttwApw
</commit_message>
<xml_diff>
--- a/reports/ABSTRACT_REPORT_ENG501.docx
+++ b/reports/ABSTRACT_REPORT_ENG501.docx
@@ -250,7 +250,7 @@
     <w:p>
       <w:pPr>
         <w:widowControl/>
-        <w:spacing w:after="140" w:line="320"/>
+        <w:spacing w:after="160" w:line="360"/>
         <w:jc w:val="left"/>
       </w:pPr>
       <w:r>
@@ -1283,7 +1283,7 @@
     <w:p>
       <w:pPr>
         <w:widowControl/>
-        <w:spacing w:after="140" w:line="320"/>
+        <w:spacing w:after="160" w:line="360"/>
         <w:jc w:val="left"/>
       </w:pPr>
       <w:r>
@@ -1333,7 +1333,7 @@
     <w:p>
       <w:pPr>
         <w:widowControl/>
-        <w:spacing w:after="140" w:line="320"/>
+        <w:spacing w:after="160" w:line="360"/>
         <w:jc w:val="left"/>
       </w:pPr>
       <w:r>
@@ -1575,7 +1575,7 @@
     <w:p>
       <w:pPr>
         <w:widowControl/>
-        <w:spacing w:after="140" w:line="320"/>
+        <w:spacing w:after="160" w:line="360"/>
         <w:jc w:val="left"/>
       </w:pPr>
       <w:r>
@@ -1625,7 +1625,7 @@
     <w:p>
       <w:pPr>
         <w:widowControl/>
-        <w:spacing w:after="140" w:line="320"/>
+        <w:spacing w:after="160" w:line="360"/>
         <w:jc w:val="left"/>
       </w:pPr>
       <w:r>
@@ -1867,7 +1867,7 @@
     <w:p>
       <w:pPr>
         <w:widowControl/>
-        <w:spacing w:after="140" w:line="320"/>
+        <w:spacing w:after="160" w:line="360"/>
         <w:jc w:val="left"/>
       </w:pPr>
       <w:r>
@@ -1917,7 +1917,7 @@
     <w:p>
       <w:pPr>
         <w:widowControl/>
-        <w:spacing w:after="140" w:line="320"/>
+        <w:spacing w:after="160" w:line="360"/>
         <w:jc w:val="left"/>
       </w:pPr>
       <w:r>
@@ -2159,7 +2159,7 @@
     <w:p>
       <w:pPr>
         <w:widowControl/>
-        <w:spacing w:after="120" w:line="320"/>
+        <w:spacing w:after="140" w:line="360"/>
         <w:ind w:left="360"/>
         <w:jc w:val="left"/>
       </w:pPr>
@@ -2186,7 +2186,7 @@
     <w:p>
       <w:pPr>
         <w:widowControl/>
-        <w:spacing w:after="120" w:line="320"/>
+        <w:spacing w:after="140" w:line="360"/>
         <w:ind w:left="360"/>
         <w:jc w:val="left"/>
       </w:pPr>
@@ -2213,7 +2213,7 @@
     <w:p>
       <w:pPr>
         <w:widowControl/>
-        <w:spacing w:after="120" w:line="320"/>
+        <w:spacing w:after="140" w:line="360"/>
         <w:ind w:left="360"/>
         <w:jc w:val="left"/>
       </w:pPr>
@@ -2240,7 +2240,7 @@
     <w:p>
       <w:pPr>
         <w:widowControl/>
-        <w:spacing w:after="120" w:line="320"/>
+        <w:spacing w:after="140" w:line="360"/>
         <w:ind w:left="360"/>
         <w:jc w:val="left"/>
       </w:pPr>
@@ -2267,7 +2267,7 @@
     <w:p>
       <w:pPr>
         <w:widowControl/>
-        <w:spacing w:after="120" w:line="320"/>
+        <w:spacing w:after="140" w:line="360"/>
         <w:ind w:left="360"/>
         <w:jc w:val="left"/>
       </w:pPr>
@@ -2294,7 +2294,7 @@
     <w:p>
       <w:pPr>
         <w:widowControl/>
-        <w:spacing w:after="120" w:line="320"/>
+        <w:spacing w:after="140" w:line="360"/>
         <w:ind w:left="360"/>
         <w:jc w:val="left"/>
       </w:pPr>
@@ -2356,7 +2356,7 @@
     <w:p>
       <w:pPr>
         <w:widowControl/>
-        <w:spacing w:after="120" w:line="320"/>
+        <w:spacing w:after="140" w:line="360"/>
         <w:ind w:left="360"/>
         <w:jc w:val="left"/>
       </w:pPr>
@@ -2383,7 +2383,7 @@
     <w:p>
       <w:pPr>
         <w:widowControl/>
-        <w:spacing w:after="120" w:line="320"/>
+        <w:spacing w:after="140" w:line="360"/>
         <w:ind w:left="360"/>
         <w:jc w:val="left"/>
       </w:pPr>
@@ -2410,7 +2410,7 @@
     <w:p>
       <w:pPr>
         <w:widowControl/>
-        <w:spacing w:after="120" w:line="320"/>
+        <w:spacing w:after="140" w:line="360"/>
         <w:ind w:left="360"/>
         <w:jc w:val="left"/>
       </w:pPr>
@@ -2437,7 +2437,7 @@
     <w:p>
       <w:pPr>
         <w:widowControl/>
-        <w:spacing w:after="120" w:line="320"/>
+        <w:spacing w:after="140" w:line="360"/>
         <w:ind w:left="360"/>
         <w:jc w:val="left"/>
       </w:pPr>
@@ -2464,7 +2464,7 @@
     <w:p>
       <w:pPr>
         <w:widowControl/>
-        <w:spacing w:after="120" w:line="320"/>
+        <w:spacing w:after="140" w:line="360"/>
         <w:ind w:left="360"/>
         <w:jc w:val="left"/>
       </w:pPr>
@@ -2491,7 +2491,7 @@
     <w:p>
       <w:pPr>
         <w:widowControl/>
-        <w:spacing w:after="120" w:line="320"/>
+        <w:spacing w:after="140" w:line="360"/>
         <w:ind w:left="360"/>
         <w:jc w:val="left"/>
       </w:pPr>
@@ -2745,7 +2745,7 @@
     <w:p>
       <w:pPr>
         <w:widowControl/>
-        <w:spacing w:after="140" w:line="320"/>
+        <w:spacing w:after="160" w:line="360"/>
         <w:jc w:val="left"/>
       </w:pPr>
       <w:r>
@@ -2795,7 +2795,7 @@
     <w:p>
       <w:pPr>
         <w:widowControl/>
-        <w:spacing w:after="140" w:line="320"/>
+        <w:spacing w:after="160" w:line="360"/>
         <w:jc w:val="left"/>
       </w:pPr>
       <w:r>

</xml_diff>